<commit_message>
Add built-in process templates and fix DOCX rendering
</commit_message>
<xml_diff>
--- a/public/templates/process-docs/子单位工程报验申请单.docx
+++ b/public/templates/process-docs/子单位工程报验申请单.docx
@@ -83,8 +83,6 @@
         </w:rPr>
         <w:t>01-001</w:t>
       </w:r>
-      <w:bookmarkStart w:id="0" w:name="_GoBack"/>
-      <w:bookmarkEnd w:id="0"/>
     </w:p>
     <w:tbl>
       <w:tblPr>
@@ -111,25 +109,9 @@
         <w:gridCol w:w="8973"/>
       </w:tblGrid>
       <w:tr>
-        <w:tblPrEx>
-          <w:tblBorders>
-            <w:top w:val="double" w:color="auto" w:sz="4" w:space="0"/>
-            <w:left w:val="double" w:color="auto" w:sz="4" w:space="0"/>
-            <w:bottom w:val="double" w:color="auto" w:sz="4" w:space="0"/>
-            <w:right w:val="double" w:color="auto" w:sz="4" w:space="0"/>
-            <w:insideH w:val="single" w:color="auto" w:sz="6" w:space="0"/>
-            <w:insideV w:val="single" w:color="auto" w:sz="6" w:space="0"/>
-          </w:tblBorders>
-          <w:tblCellMar>
-            <w:top w:w="0" w:type="dxa"/>
-            <w:left w:w="108" w:type="dxa"/>
-            <w:bottom w:w="0" w:type="dxa"/>
-            <w:right w:w="108" w:type="dxa"/>
-          </w:tblCellMar>
-        </w:tblPrEx>
         <w:trPr>
           <w:cantSplit/>
-          <w:trHeight w:val="6217" w:hRule="atLeast"/>
+          <w:trHeight w:val="5722" w:hRule="atLeast"/>
           <w:jc w:val="center"/>
         </w:trPr>
         <w:tc>
@@ -274,15 +256,8 @@
                 <w:sz w:val="24"/>
               </w:rPr>
             </w:pPr>
-          </w:p>
-          <w:p>
-            <w:pPr>
-              <w:spacing w:line="360" w:lineRule="auto"/>
-              <w:rPr>
-                <w:rFonts w:hint="eastAsia" w:ascii="宋体" w:hAnsi="宋体"/>
-                <w:sz w:val="24"/>
-              </w:rPr>
-            </w:pPr>
+            <w:bookmarkStart w:id="0" w:name="_GoBack"/>
+            <w:bookmarkEnd w:id="0"/>
           </w:p>
           <w:p>
             <w:pPr>
@@ -368,22 +343,6 @@
         </w:tc>
       </w:tr>
       <w:tr>
-        <w:tblPrEx>
-          <w:tblBorders>
-            <w:top w:val="double" w:color="auto" w:sz="4" w:space="0"/>
-            <w:left w:val="double" w:color="auto" w:sz="4" w:space="0"/>
-            <w:bottom w:val="double" w:color="auto" w:sz="4" w:space="0"/>
-            <w:right w:val="double" w:color="auto" w:sz="4" w:space="0"/>
-            <w:insideH w:val="single" w:color="auto" w:sz="6" w:space="0"/>
-            <w:insideV w:val="single" w:color="auto" w:sz="6" w:space="0"/>
-          </w:tblBorders>
-          <w:tblCellMar>
-            <w:top w:w="0" w:type="dxa"/>
-            <w:left w:w="108" w:type="dxa"/>
-            <w:bottom w:w="0" w:type="dxa"/>
-            <w:right w:w="108" w:type="dxa"/>
-          </w:tblCellMar>
-        </w:tblPrEx>
         <w:trPr>
           <w:cantSplit/>
           <w:trHeight w:val="5781" w:hRule="atLeast"/>

</xml_diff>